<commit_message>
add: alle Räume und Template fertig ohne Menü
</commit_message>
<xml_diff>
--- a/src/frontend/docs/Protokolle/Verlaufsprotokoll (iSlave).docx
+++ b/src/frontend/docs/Protokolle/Verlaufsprotokoll (iSlave).docx
@@ -16,19 +16,35 @@
         </w:numPr>
       </w:pPr>
       <w:r>
-        <w:t>Auseinandersetzung mit der Bibliothek „Pygame“</w:t>
-      </w:r>
-    </w:p>
-    <w:p>
-      <w:pPr>
-        <w:pStyle w:val="Listenabsatz"/>
-        <w:numPr>
-          <w:ilvl w:val="0"/>
-          <w:numId w:val="1"/>
-        </w:numPr>
-      </w:pPr>
-      <w:r>
-        <w:t>Einstellen und installieren von Pygame in Visual Studio Code</w:t>
+        <w:t>Auseinandersetzung mit der Bibliothek „</w:t>
+      </w:r>
+      <w:proofErr w:type="spellStart"/>
+      <w:r>
+        <w:t>Pygame</w:t>
+      </w:r>
+      <w:proofErr w:type="spellEnd"/>
+      <w:r>
+        <w:t>“</w:t>
+      </w:r>
+    </w:p>
+    <w:p>
+      <w:pPr>
+        <w:pStyle w:val="Listenabsatz"/>
+        <w:numPr>
+          <w:ilvl w:val="0"/>
+          <w:numId w:val="1"/>
+        </w:numPr>
+      </w:pPr>
+      <w:r>
+        <w:t xml:space="preserve">Einstellen und installieren von </w:t>
+      </w:r>
+      <w:proofErr w:type="spellStart"/>
+      <w:r>
+        <w:t>Pygame</w:t>
+      </w:r>
+      <w:proofErr w:type="spellEnd"/>
+      <w:r>
+        <w:t xml:space="preserve"> in Visual Studio Code</w:t>
       </w:r>
     </w:p>
     <w:p>
@@ -85,20 +101,46 @@
           <w:numId w:val="1"/>
         </w:numPr>
       </w:pPr>
-      <w:r>
-        <w:t>Deteilarbeit und Festlegung der benutzbaren Kacheln im Tileset</w:t>
-      </w:r>
-    </w:p>
-    <w:p>
-      <w:pPr>
-        <w:pStyle w:val="Listenabsatz"/>
-        <w:numPr>
-          <w:ilvl w:val="0"/>
-          <w:numId w:val="1"/>
-        </w:numPr>
-      </w:pPr>
-      <w:r>
-        <w:t>Verbindung zwischen der Datei vom Tileset und Pygame erstell</w:t>
+      <w:proofErr w:type="spellStart"/>
+      <w:r>
+        <w:t>Deteilarbeit</w:t>
+      </w:r>
+      <w:proofErr w:type="spellEnd"/>
+      <w:r>
+        <w:t xml:space="preserve"> und Festlegung der benutzbaren Kacheln im </w:t>
+      </w:r>
+      <w:proofErr w:type="spellStart"/>
+      <w:r>
+        <w:t>Tileset</w:t>
+      </w:r>
+      <w:proofErr w:type="spellEnd"/>
+    </w:p>
+    <w:p>
+      <w:pPr>
+        <w:pStyle w:val="Listenabsatz"/>
+        <w:numPr>
+          <w:ilvl w:val="0"/>
+          <w:numId w:val="1"/>
+        </w:numPr>
+      </w:pPr>
+      <w:r>
+        <w:t xml:space="preserve">Verbindung zwischen der Datei vom </w:t>
+      </w:r>
+      <w:proofErr w:type="spellStart"/>
+      <w:r>
+        <w:t>Tileset</w:t>
+      </w:r>
+      <w:proofErr w:type="spellEnd"/>
+      <w:r>
+        <w:t xml:space="preserve"> und </w:t>
+      </w:r>
+      <w:proofErr w:type="spellStart"/>
+      <w:r>
+        <w:t>Pygame</w:t>
+      </w:r>
+      <w:proofErr w:type="spellEnd"/>
+      <w:r>
+        <w:t xml:space="preserve"> erstell</w:t>
       </w:r>
       <w:r>
         <w:t>t</w:t>
@@ -113,7 +155,15 @@
         </w:numPr>
       </w:pPr>
       <w:r>
-        <w:t>Charakter-Tileset angefangen zu erstellen</w:t>
+        <w:t>Charakter-</w:t>
+      </w:r>
+      <w:proofErr w:type="spellStart"/>
+      <w:r>
+        <w:t>Tileset</w:t>
+      </w:r>
+      <w:proofErr w:type="spellEnd"/>
+      <w:r>
+        <w:t xml:space="preserve"> angefangen zu erstellen</w:t>
       </w:r>
     </w:p>
     <w:p>
@@ -130,20 +180,41 @@
         </w:numPr>
       </w:pPr>
       <w:r>
-        <w:t>Charakter-Grundstruktur- Tileset abgeschlossen</w:t>
-      </w:r>
-    </w:p>
-    <w:p>
-      <w:pPr>
-        <w:pStyle w:val="Listenabsatz"/>
-        <w:numPr>
-          <w:ilvl w:val="0"/>
-          <w:numId w:val="1"/>
-        </w:numPr>
-      </w:pPr>
-      <w:r>
-        <w:t>Einfügen und Koordinieren des Karten-Tilesets in Pygame</w:t>
-      </w:r>
+        <w:t xml:space="preserve">Charakter-Grundstruktur- </w:t>
+      </w:r>
+      <w:proofErr w:type="spellStart"/>
+      <w:r>
+        <w:t>Tileset</w:t>
+      </w:r>
+      <w:proofErr w:type="spellEnd"/>
+      <w:r>
+        <w:t xml:space="preserve"> abgeschlossen</w:t>
+      </w:r>
+    </w:p>
+    <w:p>
+      <w:pPr>
+        <w:pStyle w:val="Listenabsatz"/>
+        <w:numPr>
+          <w:ilvl w:val="0"/>
+          <w:numId w:val="1"/>
+        </w:numPr>
+      </w:pPr>
+      <w:r>
+        <w:t>Einfügen und Koordinieren des Karten-</w:t>
+      </w:r>
+      <w:proofErr w:type="spellStart"/>
+      <w:r>
+        <w:t>Tilesets</w:t>
+      </w:r>
+      <w:proofErr w:type="spellEnd"/>
+      <w:r>
+        <w:t xml:space="preserve"> in </w:t>
+      </w:r>
+      <w:proofErr w:type="spellStart"/>
+      <w:r>
+        <w:t>Pygame</w:t>
+      </w:r>
+      <w:proofErr w:type="spellEnd"/>
     </w:p>
     <w:p>
       <w:pPr>
@@ -201,7 +272,15 @@
         <w:t xml:space="preserve">laufen </w:t>
       </w:r>
       <w:r>
-        <w:t>kann bzw die Karte verlassen kann</w:t>
+        <w:t xml:space="preserve">kann </w:t>
+      </w:r>
+      <w:proofErr w:type="spellStart"/>
+      <w:r>
+        <w:t>bzw</w:t>
+      </w:r>
+      <w:proofErr w:type="spellEnd"/>
+      <w:r>
+        <w:t xml:space="preserve"> die Karte verlassen kann</w:t>
       </w:r>
     </w:p>
     <w:p>
@@ -228,7 +307,15 @@
         <w:t>NPCs  programmiert</w:t>
       </w:r>
       <w:r>
-        <w:t xml:space="preserve"> (Startposition, random Bewegungsbild)</w:t>
+        <w:t xml:space="preserve"> (Startposition, </w:t>
+      </w:r>
+      <w:proofErr w:type="spellStart"/>
+      <w:r>
+        <w:t>random</w:t>
+      </w:r>
+      <w:proofErr w:type="spellEnd"/>
+      <w:r>
+        <w:t xml:space="preserve"> Bewegungsbild)</w:t>
       </w:r>
     </w:p>
     <w:p>
@@ -289,7 +376,15 @@
         <w:t>th</w:t>
       </w:r>
       <w:r>
-        <w:t>-Map  angefangen zu konstruieren (Dusche , Fenster , Badewanne)</w:t>
+        <w:t>-</w:t>
+      </w:r>
+      <w:proofErr w:type="spellStart"/>
+      <w:r>
+        <w:t>Map</w:t>
+      </w:r>
+      <w:proofErr w:type="spellEnd"/>
+      <w:r>
+        <w:t xml:space="preserve">  angefangen zu konstruieren (Dusche , Fenster , Badewanne)</w:t>
       </w:r>
     </w:p>
     <w:p/>
@@ -310,7 +405,15 @@
         </w:numPr>
       </w:pPr>
       <w:r>
-        <w:t>Projektordner bei Git hochgeladen</w:t>
+        <w:t xml:space="preserve">Projektordner bei </w:t>
+      </w:r>
+      <w:proofErr w:type="spellStart"/>
+      <w:r>
+        <w:t>Git</w:t>
+      </w:r>
+      <w:proofErr w:type="spellEnd"/>
+      <w:r>
+        <w:t xml:space="preserve"> hochgeladen</w:t>
       </w:r>
     </w:p>
     <w:p>
@@ -433,19 +536,35 @@
         </w:numPr>
       </w:pPr>
       <w:r>
-        <w:t>Nach einer Besprechung wurde entschieden, dass die Arbeit der letzten Tage geändert wird und alles neu in TKinter gearbeitet wird</w:t>
-      </w:r>
-    </w:p>
-    <w:p>
-      <w:pPr>
-        <w:pStyle w:val="Listenabsatz"/>
-        <w:numPr>
-          <w:ilvl w:val="0"/>
-          <w:numId w:val="1"/>
-        </w:numPr>
-      </w:pPr>
-      <w:r>
-        <w:t>Es wurde angefangen, ein Template in TKinter zu kreieren, damit alle Kollegen ihre Tests besser durchführen können</w:t>
+        <w:t xml:space="preserve">Nach einer Besprechung wurde entschieden, dass die Arbeit der letzten Tage geändert wird und alles neu in </w:t>
+      </w:r>
+      <w:proofErr w:type="spellStart"/>
+      <w:r>
+        <w:t>TKinter</w:t>
+      </w:r>
+      <w:proofErr w:type="spellEnd"/>
+      <w:r>
+        <w:t xml:space="preserve"> gearbeitet wird</w:t>
+      </w:r>
+    </w:p>
+    <w:p>
+      <w:pPr>
+        <w:pStyle w:val="Listenabsatz"/>
+        <w:numPr>
+          <w:ilvl w:val="0"/>
+          <w:numId w:val="1"/>
+        </w:numPr>
+      </w:pPr>
+      <w:r>
+        <w:t xml:space="preserve">Es wurde angefangen, ein Template in </w:t>
+      </w:r>
+      <w:proofErr w:type="spellStart"/>
+      <w:r>
+        <w:t>TKinter</w:t>
+      </w:r>
+      <w:proofErr w:type="spellEnd"/>
+      <w:r>
+        <w:t xml:space="preserve"> zu kreieren, damit alle Kollegen ihre Tests besser durchführen können</w:t>
       </w:r>
     </w:p>
     <w:p>
@@ -492,6 +611,93 @@
       </w:pPr>
       <w:r>
         <w:t>Neue Klasse Terminal wurde erstellt und implementiert</w:t>
+      </w:r>
+    </w:p>
+    <w:p>
+      <w:pPr>
+        <w:pStyle w:val="Listenabsatz"/>
+        <w:numPr>
+          <w:ilvl w:val="0"/>
+          <w:numId w:val="1"/>
+        </w:numPr>
+      </w:pPr>
+      <w:r>
+        <w:t>Einschätzung mit Süheyl für Aufwand abgesprochen für Umgebung 1</w:t>
+      </w:r>
+    </w:p>
+    <w:p>
+      <w:r>
+        <w:t>Tag 14</w:t>
+      </w:r>
+    </w:p>
+    <w:p>
+      <w:pPr>
+        <w:pStyle w:val="Listenabsatz"/>
+        <w:numPr>
+          <w:ilvl w:val="0"/>
+          <w:numId w:val="1"/>
+        </w:numPr>
+      </w:pPr>
+      <w:r>
+        <w:t>Besprechung über weiteres Vorgehen</w:t>
+      </w:r>
+    </w:p>
+    <w:p>
+      <w:pPr>
+        <w:pStyle w:val="Listenabsatz"/>
+        <w:numPr>
+          <w:ilvl w:val="0"/>
+          <w:numId w:val="1"/>
+        </w:numPr>
+      </w:pPr>
+      <w:r>
+        <w:t>Einweisung in Klassenaufbau und Verlinkung zur Main</w:t>
+      </w:r>
+    </w:p>
+    <w:p>
+      <w:pPr>
+        <w:pStyle w:val="Listenabsatz"/>
+        <w:numPr>
+          <w:ilvl w:val="0"/>
+          <w:numId w:val="1"/>
+        </w:numPr>
+      </w:pPr>
+      <w:r>
+        <w:t>Testordner wurde angelegt</w:t>
+      </w:r>
+    </w:p>
+    <w:p>
+      <w:r>
+        <w:t>Tag 15</w:t>
+      </w:r>
+    </w:p>
+    <w:p>
+      <w:pPr>
+        <w:pStyle w:val="Listenabsatz"/>
+        <w:numPr>
+          <w:ilvl w:val="0"/>
+          <w:numId w:val="1"/>
+        </w:numPr>
+      </w:pPr>
+      <w:r>
+        <w:t>Aufklärung über das Aufteilen des Codes über Klassen</w:t>
+      </w:r>
+    </w:p>
+    <w:p>
+      <w:r>
+        <w:t>Tag 16</w:t>
+      </w:r>
+    </w:p>
+    <w:p>
+      <w:pPr>
+        <w:pStyle w:val="Listenabsatz"/>
+        <w:numPr>
+          <w:ilvl w:val="0"/>
+          <w:numId w:val="1"/>
+        </w:numPr>
+      </w:pPr>
+      <w:r>
+        <w:t>Bad, Küche, Wohnzimmer und Schlafzimmer sowie Template wurde fertig gestellt</w:t>
       </w:r>
     </w:p>
     <w:sectPr>

</xml_diff>